<commit_message>
鼻音韻: hng1 (哼), hm1 (噷)
唔：
(m)+(無韻母)+(元4)
(無聲母)+(m)+(鼻4)
</commit_message>
<xml_diff>
--- a/default_layout.docx
+++ b/default_layout.docx
@@ -38,10 +38,10 @@
         <w:gridCol w:w="913"/>
         <w:gridCol w:w="900"/>
         <w:gridCol w:w="913"/>
-        <w:gridCol w:w="902"/>
-        <w:gridCol w:w="916"/>
-        <w:gridCol w:w="897"/>
-        <w:gridCol w:w="906"/>
+        <w:gridCol w:w="901"/>
+        <w:gridCol w:w="917"/>
+        <w:gridCol w:w="896"/>
+        <w:gridCol w:w="907"/>
       </w:tblGrid>
       <w:tr>
         <w:trPr/>
@@ -253,7 +253,7 @@
         </w:tc>
         <w:tc>
           <w:tcPr>
-            <w:tcW w:w="902" w:type="dxa"/>
+            <w:tcW w:w="901" w:type="dxa"/>
             <w:tcBorders>
               <w:start w:val="single" w:sz="4" w:space="0" w:color="000000"/>
               <w:bottom w:val="single" w:sz="4" w:space="0" w:color="000000"/>
@@ -278,7 +278,7 @@
         </w:tc>
         <w:tc>
           <w:tcPr>
-            <w:tcW w:w="916" w:type="dxa"/>
+            <w:tcW w:w="917" w:type="dxa"/>
             <w:tcBorders>
               <w:start w:val="single" w:sz="4" w:space="0" w:color="000000"/>
               <w:bottom w:val="single" w:sz="4" w:space="0" w:color="000000"/>
@@ -303,31 +303,31 @@
         </w:tc>
         <w:tc>
           <w:tcPr>
-            <w:tcW w:w="897" w:type="dxa"/>
-            <w:tcBorders>
-              <w:start w:val="single" w:sz="4" w:space="0" w:color="000000"/>
-              <w:bottom w:val="single" w:sz="4" w:space="0" w:color="000000"/>
-            </w:tcBorders>
-          </w:tcPr>
-          <w:p>
-            <w:pPr>
-              <w:pStyle w:val="TableContents"/>
-              <w:bidi w:val="0"/>
-              <w:jc w:val="center"/>
-              <w:rPr>
-                <w:rFonts w:ascii="Source Han Sans CN" w:hAnsi="Source Han Sans CN" w:eastAsia="Source Han Sans CN"/>
-              </w:rPr>
-            </w:pPr>
-            <w:r>
-              <w:rPr>
-                <w:rFonts w:eastAsia="Source Han Sans CN" w:ascii="Source Han Sans CN" w:hAnsi="Source Han Sans CN"/>
-              </w:rPr>
-            </w:r>
-          </w:p>
-        </w:tc>
-        <w:tc>
-          <w:tcPr>
-            <w:tcW w:w="906" w:type="dxa"/>
+            <w:tcW w:w="896" w:type="dxa"/>
+            <w:tcBorders>
+              <w:start w:val="single" w:sz="4" w:space="0" w:color="000000"/>
+              <w:bottom w:val="single" w:sz="4" w:space="0" w:color="000000"/>
+            </w:tcBorders>
+          </w:tcPr>
+          <w:p>
+            <w:pPr>
+              <w:pStyle w:val="TableContents"/>
+              <w:bidi w:val="0"/>
+              <w:jc w:val="center"/>
+              <w:rPr>
+                <w:rFonts w:ascii="Source Han Sans CN" w:hAnsi="Source Han Sans CN" w:eastAsia="Source Han Sans CN"/>
+              </w:rPr>
+            </w:pPr>
+            <w:r>
+              <w:rPr>
+                <w:rFonts w:eastAsia="Source Han Sans CN" w:ascii="Source Han Sans CN" w:hAnsi="Source Han Sans CN"/>
+              </w:rPr>
+            </w:r>
+          </w:p>
+        </w:tc>
+        <w:tc>
+          <w:tcPr>
+            <w:tcW w:w="907" w:type="dxa"/>
             <w:tcBorders>
               <w:start w:val="single" w:sz="4" w:space="0" w:color="000000"/>
               <w:bottom w:val="single" w:sz="4" w:space="0" w:color="000000"/>
@@ -530,7 +530,7 @@
         </w:tc>
         <w:tc>
           <w:tcPr>
-            <w:tcW w:w="902" w:type="dxa"/>
+            <w:tcW w:w="901" w:type="dxa"/>
             <w:tcBorders>
               <w:start w:val="single" w:sz="4" w:space="0" w:color="000000"/>
               <w:bottom w:val="single" w:sz="4" w:space="0" w:color="000000"/>
@@ -555,7 +555,7 @@
         </w:tc>
         <w:tc>
           <w:tcPr>
-            <w:tcW w:w="916" w:type="dxa"/>
+            <w:tcW w:w="917" w:type="dxa"/>
             <w:tcBorders>
               <w:start w:val="single" w:sz="4" w:space="0" w:color="000000"/>
               <w:bottom w:val="single" w:sz="4" w:space="0" w:color="000000"/>
@@ -580,7 +580,7 @@
         </w:tc>
         <w:tc>
           <w:tcPr>
-            <w:tcW w:w="897" w:type="dxa"/>
+            <w:tcW w:w="896" w:type="dxa"/>
             <w:tcBorders>
               <w:start w:val="single" w:sz="4" w:space="0" w:color="000000"/>
               <w:bottom w:val="single" w:sz="4" w:space="0" w:color="000000"/>
@@ -605,7 +605,7 @@
         </w:tc>
         <w:tc>
           <w:tcPr>
-            <w:tcW w:w="906" w:type="dxa"/>
+            <w:tcW w:w="907" w:type="dxa"/>
             <w:tcBorders>
               <w:start w:val="single" w:sz="4" w:space="0" w:color="000000"/>
               <w:bottom w:val="single" w:sz="4" w:space="0" w:color="000000"/>
@@ -700,7 +700,9 @@
               </w:rPr>
             </w:pPr>
             <w:r>
-              <w:rPr/>
+              <w:rPr>
+                <w:rFonts w:eastAsia="Source Han Sans CN" w:ascii="Source Han Sans CN" w:hAnsi="Source Han Sans CN"/>
+              </w:rPr>
             </w:r>
           </w:p>
         </w:tc>
@@ -812,7 +814,7 @@
         </w:tc>
         <w:tc>
           <w:tcPr>
-            <w:tcW w:w="902" w:type="dxa"/>
+            <w:tcW w:w="901" w:type="dxa"/>
             <w:tcBorders>
               <w:start w:val="single" w:sz="4" w:space="0" w:color="000000"/>
               <w:bottom w:val="single" w:sz="4" w:space="0" w:color="000000"/>
@@ -837,55 +839,55 @@
         </w:tc>
         <w:tc>
           <w:tcPr>
-            <w:tcW w:w="916" w:type="dxa"/>
-            <w:tcBorders>
-              <w:start w:val="single" w:sz="4" w:space="0" w:color="000000"/>
-              <w:bottom w:val="single" w:sz="4" w:space="0" w:color="000000"/>
-            </w:tcBorders>
-          </w:tcPr>
-          <w:p>
-            <w:pPr>
-              <w:pStyle w:val="TableContents"/>
-              <w:bidi w:val="0"/>
-              <w:jc w:val="center"/>
-              <w:rPr>
-                <w:rFonts w:ascii="Source Han Sans CN" w:hAnsi="Source Han Sans CN" w:eastAsia="Source Han Sans CN"/>
-              </w:rPr>
-            </w:pPr>
-            <w:r>
-              <w:rPr>
-                <w:rFonts w:eastAsia="Source Han Sans CN" w:ascii="Source Han Sans CN" w:hAnsi="Source Han Sans CN"/>
-              </w:rPr>
-            </w:r>
-          </w:p>
-        </w:tc>
-        <w:tc>
-          <w:tcPr>
-            <w:tcW w:w="897" w:type="dxa"/>
-            <w:tcBorders>
-              <w:start w:val="single" w:sz="4" w:space="0" w:color="000000"/>
-              <w:bottom w:val="single" w:sz="4" w:space="0" w:color="000000"/>
-            </w:tcBorders>
-          </w:tcPr>
-          <w:p>
-            <w:pPr>
-              <w:pStyle w:val="TableContents"/>
-              <w:bidi w:val="0"/>
-              <w:jc w:val="center"/>
-              <w:rPr>
-                <w:rFonts w:ascii="Source Han Sans CN" w:hAnsi="Source Han Sans CN" w:eastAsia="Source Han Sans CN"/>
-              </w:rPr>
-            </w:pPr>
-            <w:r>
-              <w:rPr>
-                <w:rFonts w:eastAsia="Source Han Sans CN" w:ascii="Source Han Sans CN" w:hAnsi="Source Han Sans CN"/>
-              </w:rPr>
-            </w:r>
-          </w:p>
-        </w:tc>
-        <w:tc>
-          <w:tcPr>
-            <w:tcW w:w="906" w:type="dxa"/>
+            <w:tcW w:w="917" w:type="dxa"/>
+            <w:tcBorders>
+              <w:start w:val="single" w:sz="4" w:space="0" w:color="000000"/>
+              <w:bottom w:val="single" w:sz="4" w:space="0" w:color="000000"/>
+            </w:tcBorders>
+          </w:tcPr>
+          <w:p>
+            <w:pPr>
+              <w:pStyle w:val="TableContents"/>
+              <w:bidi w:val="0"/>
+              <w:jc w:val="center"/>
+              <w:rPr>
+                <w:rFonts w:ascii="Source Han Sans CN" w:hAnsi="Source Han Sans CN" w:eastAsia="Source Han Sans CN"/>
+              </w:rPr>
+            </w:pPr>
+            <w:r>
+              <w:rPr>
+                <w:rFonts w:eastAsia="Source Han Sans CN" w:ascii="Source Han Sans CN" w:hAnsi="Source Han Sans CN"/>
+              </w:rPr>
+            </w:r>
+          </w:p>
+        </w:tc>
+        <w:tc>
+          <w:tcPr>
+            <w:tcW w:w="896" w:type="dxa"/>
+            <w:tcBorders>
+              <w:start w:val="single" w:sz="4" w:space="0" w:color="000000"/>
+              <w:bottom w:val="single" w:sz="4" w:space="0" w:color="000000"/>
+            </w:tcBorders>
+          </w:tcPr>
+          <w:p>
+            <w:pPr>
+              <w:pStyle w:val="TableContents"/>
+              <w:bidi w:val="0"/>
+              <w:jc w:val="center"/>
+              <w:rPr>
+                <w:rFonts w:ascii="Source Han Sans CN" w:hAnsi="Source Han Sans CN" w:eastAsia="Source Han Sans CN"/>
+              </w:rPr>
+            </w:pPr>
+            <w:r>
+              <w:rPr>
+                <w:rFonts w:eastAsia="Source Han Sans CN" w:ascii="Source Han Sans CN" w:hAnsi="Source Han Sans CN"/>
+              </w:rPr>
+            </w:r>
+          </w:p>
+        </w:tc>
+        <w:tc>
+          <w:tcPr>
+            <w:tcW w:w="907" w:type="dxa"/>
             <w:tcBorders>
               <w:start w:val="single" w:sz="4" w:space="0" w:color="000000"/>
               <w:bottom w:val="single" w:sz="4" w:space="0" w:color="000000"/>
@@ -940,10 +942,10 @@
         <w:gridCol w:w="912"/>
         <w:gridCol w:w="901"/>
         <w:gridCol w:w="912"/>
-        <w:gridCol w:w="902"/>
-        <w:gridCol w:w="915"/>
-        <w:gridCol w:w="898"/>
-        <w:gridCol w:w="907"/>
+        <w:gridCol w:w="901"/>
+        <w:gridCol w:w="916"/>
+        <w:gridCol w:w="897"/>
+        <w:gridCol w:w="908"/>
       </w:tblGrid>
       <w:tr>
         <w:trPr/>
@@ -1191,7 +1193,7 @@
         </w:tc>
         <w:tc>
           <w:tcPr>
-            <w:tcW w:w="902" w:type="dxa"/>
+            <w:tcW w:w="901" w:type="dxa"/>
             <w:tcBorders>
               <w:start w:val="single" w:sz="4" w:space="0" w:color="000000"/>
               <w:bottom w:val="single" w:sz="4" w:space="0" w:color="000000"/>
@@ -1218,7 +1220,7 @@
         </w:tc>
         <w:tc>
           <w:tcPr>
-            <w:tcW w:w="915" w:type="dxa"/>
+            <w:tcW w:w="916" w:type="dxa"/>
             <w:tcBorders>
               <w:start w:val="single" w:sz="4" w:space="0" w:color="000000"/>
               <w:bottom w:val="single" w:sz="4" w:space="0" w:color="000000"/>
@@ -1249,7 +1251,7 @@
         </w:tc>
         <w:tc>
           <w:tcPr>
-            <w:tcW w:w="898" w:type="dxa"/>
+            <w:tcW w:w="897" w:type="dxa"/>
             <w:tcBorders>
               <w:start w:val="single" w:sz="4" w:space="0" w:color="000000"/>
               <w:bottom w:val="single" w:sz="4" w:space="0" w:color="000000"/>
@@ -1280,7 +1282,7 @@
         </w:tc>
         <w:tc>
           <w:tcPr>
-            <w:tcW w:w="907" w:type="dxa"/>
+            <w:tcW w:w="908" w:type="dxa"/>
             <w:tcBorders>
               <w:start w:val="single" w:sz="4" w:space="0" w:color="000000"/>
               <w:bottom w:val="single" w:sz="4" w:space="0" w:color="000000"/>
@@ -1324,7 +1326,9 @@
               </w:rPr>
             </w:pPr>
             <w:r>
-              <w:rPr/>
+              <w:rPr>
+                <w:rFonts w:eastAsia="Source Han Sans CN" w:ascii="Source Han Sans CN" w:hAnsi="Source Han Sans CN"/>
+              </w:rPr>
             </w:r>
           </w:p>
         </w:tc>
@@ -1503,7 +1507,7 @@
         </w:tc>
         <w:tc>
           <w:tcPr>
-            <w:tcW w:w="902" w:type="dxa"/>
+            <w:tcW w:w="901" w:type="dxa"/>
             <w:tcBorders>
               <w:start w:val="single" w:sz="4" w:space="0" w:color="000000"/>
               <w:bottom w:val="single" w:sz="4" w:space="0" w:color="000000"/>
@@ -1534,7 +1538,7 @@
         </w:tc>
         <w:tc>
           <w:tcPr>
-            <w:tcW w:w="915" w:type="dxa"/>
+            <w:tcW w:w="916" w:type="dxa"/>
             <w:tcBorders>
               <w:start w:val="single" w:sz="4" w:space="0" w:color="000000"/>
               <w:bottom w:val="single" w:sz="4" w:space="0" w:color="000000"/>
@@ -1565,7 +1569,7 @@
         </w:tc>
         <w:tc>
           <w:tcPr>
-            <w:tcW w:w="898" w:type="dxa"/>
+            <w:tcW w:w="897" w:type="dxa"/>
             <w:tcBorders>
               <w:start w:val="single" w:sz="4" w:space="0" w:color="000000"/>
               <w:bottom w:val="single" w:sz="4" w:space="0" w:color="000000"/>
@@ -1596,7 +1600,7 @@
         </w:tc>
         <w:tc>
           <w:tcPr>
-            <w:tcW w:w="907" w:type="dxa"/>
+            <w:tcW w:w="908" w:type="dxa"/>
             <w:tcBorders>
               <w:start w:val="single" w:sz="4" w:space="0" w:color="000000"/>
               <w:bottom w:val="single" w:sz="4" w:space="0" w:color="000000"/>
@@ -1613,7 +1617,9 @@
               </w:rPr>
             </w:pPr>
             <w:r>
-              <w:rPr/>
+              <w:rPr>
+                <w:rFonts w:eastAsia="Source Han Sans CN" w:ascii="Source Han Sans CN" w:hAnsi="Source Han Sans CN"/>
+              </w:rPr>
             </w:r>
           </w:p>
         </w:tc>
@@ -1821,79 +1827,79 @@
         </w:tc>
         <w:tc>
           <w:tcPr>
-            <w:tcW w:w="902" w:type="dxa"/>
-            <w:tcBorders>
-              <w:start w:val="single" w:sz="4" w:space="0" w:color="000000"/>
-              <w:bottom w:val="single" w:sz="4" w:space="0" w:color="000000"/>
-            </w:tcBorders>
-          </w:tcPr>
-          <w:p>
-            <w:pPr>
-              <w:pStyle w:val="TableContents"/>
-              <w:bidi w:val="0"/>
-              <w:jc w:val="center"/>
-              <w:rPr>
-                <w:rFonts w:ascii="Source Han Sans CN" w:hAnsi="Source Han Sans CN" w:eastAsia="Source Han Sans CN"/>
-              </w:rPr>
-            </w:pPr>
-            <w:r>
-              <w:rPr>
-                <w:rFonts w:eastAsia="Source Han Sans CN" w:ascii="Source Han Sans CN" w:hAnsi="Source Han Sans CN"/>
-              </w:rPr>
-            </w:r>
-          </w:p>
-        </w:tc>
-        <w:tc>
-          <w:tcPr>
-            <w:tcW w:w="915" w:type="dxa"/>
-            <w:tcBorders>
-              <w:start w:val="single" w:sz="4" w:space="0" w:color="000000"/>
-              <w:bottom w:val="single" w:sz="4" w:space="0" w:color="000000"/>
-            </w:tcBorders>
-          </w:tcPr>
-          <w:p>
-            <w:pPr>
-              <w:pStyle w:val="TableContents"/>
-              <w:bidi w:val="0"/>
-              <w:jc w:val="center"/>
-              <w:rPr>
-                <w:rFonts w:ascii="Source Han Sans CN" w:hAnsi="Source Han Sans CN" w:eastAsia="Source Han Sans CN"/>
-              </w:rPr>
-            </w:pPr>
-            <w:r>
-              <w:rPr>
-                <w:rFonts w:eastAsia="Source Han Sans CN" w:ascii="Source Han Sans CN" w:hAnsi="Source Han Sans CN"/>
-              </w:rPr>
-            </w:r>
-          </w:p>
-        </w:tc>
-        <w:tc>
-          <w:tcPr>
-            <w:tcW w:w="898" w:type="dxa"/>
-            <w:tcBorders>
-              <w:start w:val="single" w:sz="4" w:space="0" w:color="000000"/>
-              <w:bottom w:val="single" w:sz="4" w:space="0" w:color="000000"/>
-            </w:tcBorders>
-          </w:tcPr>
-          <w:p>
-            <w:pPr>
-              <w:pStyle w:val="TableContents"/>
-              <w:bidi w:val="0"/>
-              <w:jc w:val="center"/>
-              <w:rPr>
-                <w:rFonts w:ascii="Source Han Sans CN" w:hAnsi="Source Han Sans CN" w:eastAsia="Source Han Sans CN"/>
-              </w:rPr>
-            </w:pPr>
-            <w:r>
-              <w:rPr>
-                <w:rFonts w:eastAsia="Source Han Sans CN" w:ascii="Source Han Sans CN" w:hAnsi="Source Han Sans CN"/>
-              </w:rPr>
-            </w:r>
-          </w:p>
-        </w:tc>
-        <w:tc>
-          <w:tcPr>
-            <w:tcW w:w="907" w:type="dxa"/>
+            <w:tcW w:w="901" w:type="dxa"/>
+            <w:tcBorders>
+              <w:start w:val="single" w:sz="4" w:space="0" w:color="000000"/>
+              <w:bottom w:val="single" w:sz="4" w:space="0" w:color="000000"/>
+            </w:tcBorders>
+          </w:tcPr>
+          <w:p>
+            <w:pPr>
+              <w:pStyle w:val="TableContents"/>
+              <w:bidi w:val="0"/>
+              <w:jc w:val="center"/>
+              <w:rPr>
+                <w:rFonts w:ascii="Source Han Sans CN" w:hAnsi="Source Han Sans CN" w:eastAsia="Source Han Sans CN"/>
+              </w:rPr>
+            </w:pPr>
+            <w:r>
+              <w:rPr>
+                <w:rFonts w:eastAsia="Source Han Sans CN" w:ascii="Source Han Sans CN" w:hAnsi="Source Han Sans CN"/>
+              </w:rPr>
+            </w:r>
+          </w:p>
+        </w:tc>
+        <w:tc>
+          <w:tcPr>
+            <w:tcW w:w="916" w:type="dxa"/>
+            <w:tcBorders>
+              <w:start w:val="single" w:sz="4" w:space="0" w:color="000000"/>
+              <w:bottom w:val="single" w:sz="4" w:space="0" w:color="000000"/>
+            </w:tcBorders>
+          </w:tcPr>
+          <w:p>
+            <w:pPr>
+              <w:pStyle w:val="TableContents"/>
+              <w:bidi w:val="0"/>
+              <w:jc w:val="center"/>
+              <w:rPr>
+                <w:rFonts w:ascii="Source Han Sans CN" w:hAnsi="Source Han Sans CN" w:eastAsia="Source Han Sans CN"/>
+              </w:rPr>
+            </w:pPr>
+            <w:r>
+              <w:rPr>
+                <w:rFonts w:eastAsia="Source Han Sans CN" w:ascii="Source Han Sans CN" w:hAnsi="Source Han Sans CN"/>
+              </w:rPr>
+            </w:r>
+          </w:p>
+        </w:tc>
+        <w:tc>
+          <w:tcPr>
+            <w:tcW w:w="897" w:type="dxa"/>
+            <w:tcBorders>
+              <w:start w:val="single" w:sz="4" w:space="0" w:color="000000"/>
+              <w:bottom w:val="single" w:sz="4" w:space="0" w:color="000000"/>
+            </w:tcBorders>
+          </w:tcPr>
+          <w:p>
+            <w:pPr>
+              <w:pStyle w:val="TableContents"/>
+              <w:bidi w:val="0"/>
+              <w:jc w:val="center"/>
+              <w:rPr>
+                <w:rFonts w:ascii="Source Han Sans CN" w:hAnsi="Source Han Sans CN" w:eastAsia="Source Han Sans CN"/>
+              </w:rPr>
+            </w:pPr>
+            <w:r>
+              <w:rPr>
+                <w:rFonts w:eastAsia="Source Han Sans CN" w:ascii="Source Han Sans CN" w:hAnsi="Source Han Sans CN"/>
+              </w:rPr>
+            </w:r>
+          </w:p>
+        </w:tc>
+        <w:tc>
+          <w:tcPr>
+            <w:tcW w:w="908" w:type="dxa"/>
             <w:tcBorders>
               <w:start w:val="single" w:sz="4" w:space="0" w:color="000000"/>
               <w:bottom w:val="single" w:sz="4" w:space="0" w:color="000000"/>
@@ -1954,10 +1960,10 @@
         <w:gridCol w:w="913"/>
         <w:gridCol w:w="900"/>
         <w:gridCol w:w="913"/>
-        <w:gridCol w:w="902"/>
-        <w:gridCol w:w="916"/>
-        <w:gridCol w:w="897"/>
-        <w:gridCol w:w="906"/>
+        <w:gridCol w:w="901"/>
+        <w:gridCol w:w="917"/>
+        <w:gridCol w:w="896"/>
+        <w:gridCol w:w="907"/>
       </w:tblGrid>
       <w:tr>
         <w:trPr/>
@@ -2168,7 +2174,7 @@
         </w:tc>
         <w:tc>
           <w:tcPr>
-            <w:tcW w:w="902" w:type="dxa"/>
+            <w:tcW w:w="901" w:type="dxa"/>
             <w:tcBorders>
               <w:start w:val="single" w:sz="4" w:space="0" w:color="000000"/>
               <w:bottom w:val="single" w:sz="4" w:space="0" w:color="000000"/>
@@ -2193,7 +2199,7 @@
         </w:tc>
         <w:tc>
           <w:tcPr>
-            <w:tcW w:w="916" w:type="dxa"/>
+            <w:tcW w:w="917" w:type="dxa"/>
             <w:tcBorders>
               <w:start w:val="single" w:sz="4" w:space="0" w:color="000000"/>
               <w:bottom w:val="single" w:sz="4" w:space="0" w:color="000000"/>
@@ -2218,7 +2224,7 @@
         </w:tc>
         <w:tc>
           <w:tcPr>
-            <w:tcW w:w="897" w:type="dxa"/>
+            <w:tcW w:w="896" w:type="dxa"/>
             <w:tcBorders>
               <w:start w:val="single" w:sz="4" w:space="0" w:color="000000"/>
               <w:bottom w:val="single" w:sz="4" w:space="0" w:color="000000"/>
@@ -2243,7 +2249,7 @@
         </w:tc>
         <w:tc>
           <w:tcPr>
-            <w:tcW w:w="906" w:type="dxa"/>
+            <w:tcW w:w="907" w:type="dxa"/>
             <w:tcBorders>
               <w:start w:val="single" w:sz="4" w:space="0" w:color="000000"/>
               <w:bottom w:val="single" w:sz="4" w:space="0" w:color="000000"/>
@@ -2444,7 +2450,7 @@
         </w:tc>
         <w:tc>
           <w:tcPr>
-            <w:tcW w:w="902" w:type="dxa"/>
+            <w:tcW w:w="901" w:type="dxa"/>
             <w:tcBorders>
               <w:start w:val="single" w:sz="4" w:space="0" w:color="000000"/>
               <w:bottom w:val="single" w:sz="4" w:space="0" w:color="000000"/>
@@ -2469,7 +2475,7 @@
         </w:tc>
         <w:tc>
           <w:tcPr>
-            <w:tcW w:w="916" w:type="dxa"/>
+            <w:tcW w:w="917" w:type="dxa"/>
             <w:tcBorders>
               <w:start w:val="single" w:sz="4" w:space="0" w:color="000000"/>
               <w:bottom w:val="single" w:sz="4" w:space="0" w:color="000000"/>
@@ -2494,7 +2500,7 @@
         </w:tc>
         <w:tc>
           <w:tcPr>
-            <w:tcW w:w="897" w:type="dxa"/>
+            <w:tcW w:w="896" w:type="dxa"/>
             <w:tcBorders>
               <w:start w:val="single" w:sz="4" w:space="0" w:color="000000"/>
               <w:bottom w:val="single" w:sz="4" w:space="0" w:color="000000"/>
@@ -2519,7 +2525,7 @@
         </w:tc>
         <w:tc>
           <w:tcPr>
-            <w:tcW w:w="906" w:type="dxa"/>
+            <w:tcW w:w="907" w:type="dxa"/>
             <w:tcBorders>
               <w:start w:val="single" w:sz="4" w:space="0" w:color="000000"/>
               <w:bottom w:val="single" w:sz="4" w:space="0" w:color="000000"/>
@@ -2722,7 +2728,7 @@
         </w:tc>
         <w:tc>
           <w:tcPr>
-            <w:tcW w:w="902" w:type="dxa"/>
+            <w:tcW w:w="901" w:type="dxa"/>
             <w:tcBorders>
               <w:start w:val="single" w:sz="4" w:space="0" w:color="000000"/>
               <w:bottom w:val="single" w:sz="4" w:space="0" w:color="000000"/>
@@ -2747,7 +2753,7 @@
         </w:tc>
         <w:tc>
           <w:tcPr>
-            <w:tcW w:w="916" w:type="dxa"/>
+            <w:tcW w:w="917" w:type="dxa"/>
             <w:tcBorders>
               <w:start w:val="single" w:sz="4" w:space="0" w:color="000000"/>
               <w:bottom w:val="single" w:sz="4" w:space="0" w:color="000000"/>
@@ -2772,7 +2778,7 @@
         </w:tc>
         <w:tc>
           <w:tcPr>
-            <w:tcW w:w="897" w:type="dxa"/>
+            <w:tcW w:w="896" w:type="dxa"/>
             <w:tcBorders>
               <w:start w:val="single" w:sz="4" w:space="0" w:color="000000"/>
               <w:bottom w:val="single" w:sz="4" w:space="0" w:color="000000"/>
@@ -2797,7 +2803,7 @@
         </w:tc>
         <w:tc>
           <w:tcPr>
-            <w:tcW w:w="906" w:type="dxa"/>
+            <w:tcW w:w="907" w:type="dxa"/>
             <w:tcBorders>
               <w:start w:val="single" w:sz="4" w:space="0" w:color="000000"/>
               <w:bottom w:val="single" w:sz="4" w:space="0" w:color="000000"/>
@@ -2858,10 +2864,10 @@
         <w:gridCol w:w="913"/>
         <w:gridCol w:w="900"/>
         <w:gridCol w:w="913"/>
-        <w:gridCol w:w="902"/>
-        <w:gridCol w:w="916"/>
-        <w:gridCol w:w="897"/>
-        <w:gridCol w:w="906"/>
+        <w:gridCol w:w="901"/>
+        <w:gridCol w:w="917"/>
+        <w:gridCol w:w="896"/>
+        <w:gridCol w:w="907"/>
       </w:tblGrid>
       <w:tr>
         <w:trPr/>
@@ -3018,6 +3024,7 @@
               <w:rPr>
                 <w:rFonts w:eastAsia="Source Han Sans CN" w:ascii="Source Han Sans CN" w:hAnsi="Source Han Sans CN"/>
               </w:rPr>
+              <w:t>ng</w:t>
             </w:r>
           </w:p>
         </w:tc>
@@ -3072,7 +3079,7 @@
         </w:tc>
         <w:tc>
           <w:tcPr>
-            <w:tcW w:w="902" w:type="dxa"/>
+            <w:tcW w:w="901" w:type="dxa"/>
             <w:tcBorders>
               <w:start w:val="single" w:sz="4" w:space="0" w:color="000000"/>
               <w:bottom w:val="single" w:sz="4" w:space="0" w:color="000000"/>
@@ -3097,7 +3104,7 @@
         </w:tc>
         <w:tc>
           <w:tcPr>
-            <w:tcW w:w="916" w:type="dxa"/>
+            <w:tcW w:w="917" w:type="dxa"/>
             <w:tcBorders>
               <w:start w:val="single" w:sz="4" w:space="0" w:color="000000"/>
               <w:bottom w:val="single" w:sz="4" w:space="0" w:color="000000"/>
@@ -3122,7 +3129,7 @@
         </w:tc>
         <w:tc>
           <w:tcPr>
-            <w:tcW w:w="897" w:type="dxa"/>
+            <w:tcW w:w="896" w:type="dxa"/>
             <w:tcBorders>
               <w:start w:val="single" w:sz="4" w:space="0" w:color="000000"/>
               <w:bottom w:val="single" w:sz="4" w:space="0" w:color="000000"/>
@@ -3147,7 +3154,7 @@
         </w:tc>
         <w:tc>
           <w:tcPr>
-            <w:tcW w:w="906" w:type="dxa"/>
+            <w:tcW w:w="907" w:type="dxa"/>
             <w:tcBorders>
               <w:start w:val="single" w:sz="4" w:space="0" w:color="000000"/>
               <w:bottom w:val="single" w:sz="4" w:space="0" w:color="000000"/>
@@ -3293,9 +3300,9 @@
             </w:pPr>
             <w:r>
               <w:rPr>
-                <w:rFonts w:ascii="Source Han Sans CN" w:hAnsi="Source Han Sans CN" w:eastAsia="Source Han Sans CN"/>
-              </w:rPr>
-              <w:t>鼻音韻</w:t>
+                <w:rFonts w:eastAsia="Source Han Sans CN" w:ascii="Source Han Sans CN" w:hAnsi="Source Han Sans CN"/>
+              </w:rPr>
+              <w:t>n</w:t>
             </w:r>
           </w:p>
         </w:tc>
@@ -3351,7 +3358,7 @@
         </w:tc>
         <w:tc>
           <w:tcPr>
-            <w:tcW w:w="902" w:type="dxa"/>
+            <w:tcW w:w="901" w:type="dxa"/>
             <w:tcBorders>
               <w:start w:val="single" w:sz="4" w:space="0" w:color="000000"/>
               <w:bottom w:val="single" w:sz="4" w:space="0" w:color="000000"/>
@@ -3376,31 +3383,31 @@
         </w:tc>
         <w:tc>
           <w:tcPr>
-            <w:tcW w:w="916" w:type="dxa"/>
-            <w:tcBorders>
-              <w:start w:val="single" w:sz="4" w:space="0" w:color="000000"/>
-              <w:bottom w:val="single" w:sz="4" w:space="0" w:color="000000"/>
-            </w:tcBorders>
-          </w:tcPr>
-          <w:p>
-            <w:pPr>
-              <w:pStyle w:val="TableContents"/>
-              <w:bidi w:val="0"/>
-              <w:jc w:val="center"/>
-              <w:rPr>
-                <w:rFonts w:ascii="Source Han Sans CN" w:hAnsi="Source Han Sans CN" w:eastAsia="Source Han Sans CN"/>
-              </w:rPr>
-            </w:pPr>
-            <w:r>
-              <w:rPr>
-                <w:rFonts w:eastAsia="Source Han Sans CN" w:ascii="Source Han Sans CN" w:hAnsi="Source Han Sans CN"/>
-              </w:rPr>
-            </w:r>
-          </w:p>
-        </w:tc>
-        <w:tc>
-          <w:tcPr>
-            <w:tcW w:w="897" w:type="dxa"/>
+            <w:tcW w:w="917" w:type="dxa"/>
+            <w:tcBorders>
+              <w:start w:val="single" w:sz="4" w:space="0" w:color="000000"/>
+              <w:bottom w:val="single" w:sz="4" w:space="0" w:color="000000"/>
+            </w:tcBorders>
+          </w:tcPr>
+          <w:p>
+            <w:pPr>
+              <w:pStyle w:val="TableContents"/>
+              <w:bidi w:val="0"/>
+              <w:jc w:val="center"/>
+              <w:rPr>
+                <w:rFonts w:ascii="Source Han Sans CN" w:hAnsi="Source Han Sans CN" w:eastAsia="Source Han Sans CN"/>
+              </w:rPr>
+            </w:pPr>
+            <w:r>
+              <w:rPr>
+                <w:rFonts w:eastAsia="Source Han Sans CN" w:ascii="Source Han Sans CN" w:hAnsi="Source Han Sans CN"/>
+              </w:rPr>
+            </w:r>
+          </w:p>
+        </w:tc>
+        <w:tc>
+          <w:tcPr>
+            <w:tcW w:w="896" w:type="dxa"/>
             <w:tcBorders>
               <w:start w:val="single" w:sz="4" w:space="0" w:color="000000"/>
               <w:bottom w:val="single" w:sz="4" w:space="0" w:color="000000"/>
@@ -3425,7 +3432,7 @@
         </w:tc>
         <w:tc>
           <w:tcPr>
-            <w:tcW w:w="906" w:type="dxa"/>
+            <w:tcW w:w="907" w:type="dxa"/>
             <w:tcBorders>
               <w:start w:val="single" w:sz="4" w:space="0" w:color="000000"/>
               <w:bottom w:val="single" w:sz="4" w:space="0" w:color="000000"/>
@@ -3572,6 +3579,7 @@
               <w:rPr>
                 <w:rFonts w:eastAsia="Source Han Sans CN" w:ascii="Source Han Sans CN" w:hAnsi="Source Han Sans CN"/>
               </w:rPr>
+              <w:t>m</w:t>
             </w:r>
           </w:p>
         </w:tc>
@@ -3626,7 +3634,7 @@
         </w:tc>
         <w:tc>
           <w:tcPr>
-            <w:tcW w:w="902" w:type="dxa"/>
+            <w:tcW w:w="901" w:type="dxa"/>
             <w:tcBorders>
               <w:start w:val="single" w:sz="4" w:space="0" w:color="000000"/>
               <w:bottom w:val="single" w:sz="4" w:space="0" w:color="000000"/>
@@ -3651,7 +3659,7 @@
         </w:tc>
         <w:tc>
           <w:tcPr>
-            <w:tcW w:w="916" w:type="dxa"/>
+            <w:tcW w:w="917" w:type="dxa"/>
             <w:tcBorders>
               <w:start w:val="single" w:sz="4" w:space="0" w:color="000000"/>
               <w:bottom w:val="single" w:sz="4" w:space="0" w:color="000000"/>
@@ -3676,31 +3684,31 @@
         </w:tc>
         <w:tc>
           <w:tcPr>
-            <w:tcW w:w="897" w:type="dxa"/>
-            <w:tcBorders>
-              <w:start w:val="single" w:sz="4" w:space="0" w:color="000000"/>
-              <w:bottom w:val="single" w:sz="4" w:space="0" w:color="000000"/>
-            </w:tcBorders>
-          </w:tcPr>
-          <w:p>
-            <w:pPr>
-              <w:pStyle w:val="TableContents"/>
-              <w:bidi w:val="0"/>
-              <w:jc w:val="center"/>
-              <w:rPr>
-                <w:rFonts w:ascii="Source Han Sans CN" w:hAnsi="Source Han Sans CN" w:eastAsia="Source Han Sans CN"/>
-              </w:rPr>
-            </w:pPr>
-            <w:r>
-              <w:rPr>
-                <w:rFonts w:eastAsia="Source Han Sans CN" w:ascii="Source Han Sans CN" w:hAnsi="Source Han Sans CN"/>
-              </w:rPr>
-            </w:r>
-          </w:p>
-        </w:tc>
-        <w:tc>
-          <w:tcPr>
-            <w:tcW w:w="906" w:type="dxa"/>
+            <w:tcW w:w="896" w:type="dxa"/>
+            <w:tcBorders>
+              <w:start w:val="single" w:sz="4" w:space="0" w:color="000000"/>
+              <w:bottom w:val="single" w:sz="4" w:space="0" w:color="000000"/>
+            </w:tcBorders>
+          </w:tcPr>
+          <w:p>
+            <w:pPr>
+              <w:pStyle w:val="TableContents"/>
+              <w:bidi w:val="0"/>
+              <w:jc w:val="center"/>
+              <w:rPr>
+                <w:rFonts w:ascii="Source Han Sans CN" w:hAnsi="Source Han Sans CN" w:eastAsia="Source Han Sans CN"/>
+              </w:rPr>
+            </w:pPr>
+            <w:r>
+              <w:rPr>
+                <w:rFonts w:eastAsia="Source Han Sans CN" w:ascii="Source Han Sans CN" w:hAnsi="Source Han Sans CN"/>
+              </w:rPr>
+            </w:r>
+          </w:p>
+        </w:tc>
+        <w:tc>
+          <w:tcPr>
+            <w:tcW w:w="907" w:type="dxa"/>
             <w:tcBorders>
               <w:start w:val="single" w:sz="4" w:space="0" w:color="000000"/>
               <w:bottom w:val="single" w:sz="4" w:space="0" w:color="000000"/>
@@ -3761,10 +3769,10 @@
         <w:gridCol w:w="913"/>
         <w:gridCol w:w="900"/>
         <w:gridCol w:w="913"/>
-        <w:gridCol w:w="902"/>
-        <w:gridCol w:w="916"/>
-        <w:gridCol w:w="897"/>
-        <w:gridCol w:w="906"/>
+        <w:gridCol w:w="901"/>
+        <w:gridCol w:w="917"/>
+        <w:gridCol w:w="896"/>
+        <w:gridCol w:w="907"/>
       </w:tblGrid>
       <w:tr>
         <w:trPr/>
@@ -3975,7 +3983,7 @@
         </w:tc>
         <w:tc>
           <w:tcPr>
-            <w:tcW w:w="902" w:type="dxa"/>
+            <w:tcW w:w="901" w:type="dxa"/>
             <w:tcBorders>
               <w:start w:val="single" w:sz="4" w:space="0" w:color="000000"/>
               <w:bottom w:val="single" w:sz="4" w:space="0" w:color="000000"/>
@@ -4000,7 +4008,7 @@
         </w:tc>
         <w:tc>
           <w:tcPr>
-            <w:tcW w:w="916" w:type="dxa"/>
+            <w:tcW w:w="917" w:type="dxa"/>
             <w:tcBorders>
               <w:start w:val="single" w:sz="4" w:space="0" w:color="000000"/>
               <w:bottom w:val="single" w:sz="4" w:space="0" w:color="000000"/>
@@ -4025,7 +4033,7 @@
         </w:tc>
         <w:tc>
           <w:tcPr>
-            <w:tcW w:w="897" w:type="dxa"/>
+            <w:tcW w:w="896" w:type="dxa"/>
             <w:tcBorders>
               <w:start w:val="single" w:sz="4" w:space="0" w:color="000000"/>
               <w:bottom w:val="single" w:sz="4" w:space="0" w:color="000000"/>
@@ -4050,7 +4058,7 @@
         </w:tc>
         <w:tc>
           <w:tcPr>
-            <w:tcW w:w="906" w:type="dxa"/>
+            <w:tcW w:w="907" w:type="dxa"/>
             <w:tcBorders>
               <w:start w:val="single" w:sz="4" w:space="0" w:color="000000"/>
               <w:bottom w:val="single" w:sz="4" w:space="0" w:color="000000"/>
@@ -4253,7 +4261,7 @@
         </w:tc>
         <w:tc>
           <w:tcPr>
-            <w:tcW w:w="902" w:type="dxa"/>
+            <w:tcW w:w="901" w:type="dxa"/>
             <w:tcBorders>
               <w:start w:val="single" w:sz="4" w:space="0" w:color="000000"/>
               <w:bottom w:val="single" w:sz="4" w:space="0" w:color="000000"/>
@@ -4278,7 +4286,7 @@
         </w:tc>
         <w:tc>
           <w:tcPr>
-            <w:tcW w:w="916" w:type="dxa"/>
+            <w:tcW w:w="917" w:type="dxa"/>
             <w:tcBorders>
               <w:start w:val="single" w:sz="4" w:space="0" w:color="000000"/>
               <w:bottom w:val="single" w:sz="4" w:space="0" w:color="000000"/>
@@ -4303,7 +4311,7 @@
         </w:tc>
         <w:tc>
           <w:tcPr>
-            <w:tcW w:w="897" w:type="dxa"/>
+            <w:tcW w:w="896" w:type="dxa"/>
             <w:tcBorders>
               <w:start w:val="single" w:sz="4" w:space="0" w:color="000000"/>
               <w:bottom w:val="single" w:sz="4" w:space="0" w:color="000000"/>
@@ -4328,7 +4336,7 @@
         </w:tc>
         <w:tc>
           <w:tcPr>
-            <w:tcW w:w="906" w:type="dxa"/>
+            <w:tcW w:w="907" w:type="dxa"/>
             <w:tcBorders>
               <w:start w:val="single" w:sz="4" w:space="0" w:color="000000"/>
               <w:bottom w:val="single" w:sz="4" w:space="0" w:color="000000"/>
@@ -4530,7 +4538,7 @@
         </w:tc>
         <w:tc>
           <w:tcPr>
-            <w:tcW w:w="902" w:type="dxa"/>
+            <w:tcW w:w="901" w:type="dxa"/>
             <w:tcBorders>
               <w:start w:val="single" w:sz="4" w:space="0" w:color="000000"/>
               <w:bottom w:val="single" w:sz="4" w:space="0" w:color="000000"/>
@@ -4555,7 +4563,7 @@
         </w:tc>
         <w:tc>
           <w:tcPr>
-            <w:tcW w:w="916" w:type="dxa"/>
+            <w:tcW w:w="917" w:type="dxa"/>
             <w:tcBorders>
               <w:start w:val="single" w:sz="4" w:space="0" w:color="000000"/>
               <w:bottom w:val="single" w:sz="4" w:space="0" w:color="000000"/>
@@ -4580,31 +4588,31 @@
         </w:tc>
         <w:tc>
           <w:tcPr>
-            <w:tcW w:w="897" w:type="dxa"/>
-            <w:tcBorders>
-              <w:start w:val="single" w:sz="4" w:space="0" w:color="000000"/>
-              <w:bottom w:val="single" w:sz="4" w:space="0" w:color="000000"/>
-            </w:tcBorders>
-          </w:tcPr>
-          <w:p>
-            <w:pPr>
-              <w:pStyle w:val="TableContents"/>
-              <w:bidi w:val="0"/>
-              <w:jc w:val="center"/>
-              <w:rPr>
-                <w:rFonts w:ascii="Source Han Sans CN" w:hAnsi="Source Han Sans CN" w:eastAsia="Source Han Sans CN"/>
-              </w:rPr>
-            </w:pPr>
-            <w:r>
-              <w:rPr>
-                <w:rFonts w:eastAsia="Source Han Sans CN" w:ascii="Source Han Sans CN" w:hAnsi="Source Han Sans CN"/>
-              </w:rPr>
-            </w:r>
-          </w:p>
-        </w:tc>
-        <w:tc>
-          <w:tcPr>
-            <w:tcW w:w="906" w:type="dxa"/>
+            <w:tcW w:w="896" w:type="dxa"/>
+            <w:tcBorders>
+              <w:start w:val="single" w:sz="4" w:space="0" w:color="000000"/>
+              <w:bottom w:val="single" w:sz="4" w:space="0" w:color="000000"/>
+            </w:tcBorders>
+          </w:tcPr>
+          <w:p>
+            <w:pPr>
+              <w:pStyle w:val="TableContents"/>
+              <w:bidi w:val="0"/>
+              <w:jc w:val="center"/>
+              <w:rPr>
+                <w:rFonts w:ascii="Source Han Sans CN" w:hAnsi="Source Han Sans CN" w:eastAsia="Source Han Sans CN"/>
+              </w:rPr>
+            </w:pPr>
+            <w:r>
+              <w:rPr>
+                <w:rFonts w:eastAsia="Source Han Sans CN" w:ascii="Source Han Sans CN" w:hAnsi="Source Han Sans CN"/>
+              </w:rPr>
+            </w:r>
+          </w:p>
+        </w:tc>
+        <w:tc>
+          <w:tcPr>
+            <w:tcW w:w="907" w:type="dxa"/>
             <w:tcBorders>
               <w:start w:val="single" w:sz="4" w:space="0" w:color="000000"/>
               <w:bottom w:val="single" w:sz="4" w:space="0" w:color="000000"/>
@@ -4660,10 +4668,10 @@
         <w:gridCol w:w="913"/>
         <w:gridCol w:w="900"/>
         <w:gridCol w:w="913"/>
-        <w:gridCol w:w="902"/>
-        <w:gridCol w:w="916"/>
-        <w:gridCol w:w="897"/>
-        <w:gridCol w:w="906"/>
+        <w:gridCol w:w="901"/>
+        <w:gridCol w:w="917"/>
+        <w:gridCol w:w="896"/>
+        <w:gridCol w:w="907"/>
       </w:tblGrid>
       <w:tr>
         <w:trPr/>
@@ -4875,7 +4883,7 @@
         </w:tc>
         <w:tc>
           <w:tcPr>
-            <w:tcW w:w="902" w:type="dxa"/>
+            <w:tcW w:w="901" w:type="dxa"/>
             <w:tcBorders>
               <w:start w:val="single" w:sz="4" w:space="0" w:color="000000"/>
               <w:bottom w:val="single" w:sz="4" w:space="0" w:color="000000"/>
@@ -4900,7 +4908,7 @@
         </w:tc>
         <w:tc>
           <w:tcPr>
-            <w:tcW w:w="916" w:type="dxa"/>
+            <w:tcW w:w="917" w:type="dxa"/>
             <w:tcBorders>
               <w:start w:val="single" w:sz="4" w:space="0" w:color="000000"/>
               <w:bottom w:val="single" w:sz="4" w:space="0" w:color="000000"/>
@@ -4925,7 +4933,7 @@
         </w:tc>
         <w:tc>
           <w:tcPr>
-            <w:tcW w:w="897" w:type="dxa"/>
+            <w:tcW w:w="896" w:type="dxa"/>
             <w:tcBorders>
               <w:start w:val="single" w:sz="4" w:space="0" w:color="000000"/>
               <w:bottom w:val="single" w:sz="4" w:space="0" w:color="000000"/>
@@ -4950,7 +4958,7 @@
         </w:tc>
         <w:tc>
           <w:tcPr>
-            <w:tcW w:w="906" w:type="dxa"/>
+            <w:tcW w:w="907" w:type="dxa"/>
             <w:tcBorders>
               <w:start w:val="single" w:sz="4" w:space="0" w:color="000000"/>
               <w:bottom w:val="single" w:sz="4" w:space="0" w:color="000000"/>
@@ -5154,7 +5162,7 @@
         </w:tc>
         <w:tc>
           <w:tcPr>
-            <w:tcW w:w="902" w:type="dxa"/>
+            <w:tcW w:w="901" w:type="dxa"/>
             <w:tcBorders>
               <w:start w:val="single" w:sz="4" w:space="0" w:color="000000"/>
               <w:bottom w:val="single" w:sz="4" w:space="0" w:color="000000"/>
@@ -5179,7 +5187,7 @@
         </w:tc>
         <w:tc>
           <w:tcPr>
-            <w:tcW w:w="916" w:type="dxa"/>
+            <w:tcW w:w="917" w:type="dxa"/>
             <w:tcBorders>
               <w:start w:val="single" w:sz="4" w:space="0" w:color="000000"/>
               <w:bottom w:val="single" w:sz="4" w:space="0" w:color="000000"/>
@@ -5204,7 +5212,7 @@
         </w:tc>
         <w:tc>
           <w:tcPr>
-            <w:tcW w:w="897" w:type="dxa"/>
+            <w:tcW w:w="896" w:type="dxa"/>
             <w:tcBorders>
               <w:start w:val="single" w:sz="4" w:space="0" w:color="000000"/>
               <w:bottom w:val="single" w:sz="4" w:space="0" w:color="000000"/>
@@ -5229,7 +5237,7 @@
         </w:tc>
         <w:tc>
           <w:tcPr>
-            <w:tcW w:w="906" w:type="dxa"/>
+            <w:tcW w:w="907" w:type="dxa"/>
             <w:tcBorders>
               <w:start w:val="single" w:sz="4" w:space="0" w:color="000000"/>
               <w:bottom w:val="single" w:sz="4" w:space="0" w:color="000000"/>
@@ -5435,7 +5443,7 @@
         </w:tc>
         <w:tc>
           <w:tcPr>
-            <w:tcW w:w="902" w:type="dxa"/>
+            <w:tcW w:w="901" w:type="dxa"/>
             <w:tcBorders>
               <w:start w:val="single" w:sz="4" w:space="0" w:color="000000"/>
               <w:bottom w:val="single" w:sz="4" w:space="0" w:color="000000"/>
@@ -5460,7 +5468,7 @@
         </w:tc>
         <w:tc>
           <w:tcPr>
-            <w:tcW w:w="916" w:type="dxa"/>
+            <w:tcW w:w="917" w:type="dxa"/>
             <w:tcBorders>
               <w:start w:val="single" w:sz="4" w:space="0" w:color="000000"/>
               <w:bottom w:val="single" w:sz="4" w:space="0" w:color="000000"/>
@@ -5485,7 +5493,7 @@
         </w:tc>
         <w:tc>
           <w:tcPr>
-            <w:tcW w:w="897" w:type="dxa"/>
+            <w:tcW w:w="896" w:type="dxa"/>
             <w:tcBorders>
               <w:start w:val="single" w:sz="4" w:space="0" w:color="000000"/>
               <w:bottom w:val="single" w:sz="4" w:space="0" w:color="000000"/>
@@ -5512,7 +5520,7 @@
         </w:tc>
         <w:tc>
           <w:tcPr>
-            <w:tcW w:w="906" w:type="dxa"/>
+            <w:tcW w:w="907" w:type="dxa"/>
             <w:tcBorders>
               <w:start w:val="single" w:sz="4" w:space="0" w:color="000000"/>
               <w:bottom w:val="single" w:sz="4" w:space="0" w:color="000000"/>
@@ -5612,13 +5620,13 @@
       <w:u w:val="single"/>
     </w:rPr>
   </w:style>
-  <w:style w:type="character" w:styleId="FootnoteCharactersuser">
-    <w:name w:val="Footnote Characters (user)"/>
+  <w:style w:type="character" w:styleId="FootnoteCharacters">
+    <w:name w:val="Footnote Characters"/>
     <w:qFormat/>
     <w:rPr/>
   </w:style>
-  <w:style w:type="character" w:styleId="EndnoteCharactersuser">
-    <w:name w:val="Endnote Characters (user)"/>
+  <w:style w:type="character" w:styleId="EndnoteCharacters">
+    <w:name w:val="Endnote Characters"/>
     <w:qFormat/>
     <w:rPr/>
   </w:style>

</xml_diff>